<commit_message>
Sprint 57: a way to complain (ADR-067)
/contact and /grievance are real forms behind a new grievances module and
table (migration 0050), with an operator queue that marks what is overdue
against the grievance page's own 24-hour and 15-day promise.

- A stranger may send a message or grievance and must leave somewhere to
  reply; a request about one's own data needs an account.
- No relay: nothing is written to an address a stranger typed. A signed-in
  sender gets an in-app notice (never the operator's note).
- Public endpoint limits: enforce_budget per address and per sender, a
  honeypot, a length cap.
- Operator queue on /admin (support and admin tiers), account masked,
  decisions locked and final; default view is everything, owed first.
- Closed messages purged after a year (open never); export and erasure.
- 34 backend tests (mutation-checked), web component tests, browser journey.

Co-Authored-By: Claude Sonnet 5.5 <noreply@anthropic.com>
</commit_message>
<xml_diff>
--- a/docs/IISM-Product-Backlog.docx
+++ b/docs/IISM-Product-Backlog.docx
@@ -61,7 +61,7 @@
           <w:color w:val="3C4752"/>
           <w:sz w:val="24"/>
         </w:rPr>
-        <w:t>Document Version 1.16</w:t>
+        <w:t>Document Version 1.17</w:t>
       </w:r>
     </w:p>
     <w:p>
@@ -196,7 +196,7 @@
                 <w:color w:val="3C4752"/>
                 <w:sz w:val="19"/>
               </w:rPr>
-              <w:t>1.16</w:t>
+              <w:t>1.17</w:t>
             </w:r>
           </w:p>
         </w:tc>
@@ -2355,6 +2355,108 @@
           </w:p>
         </w:tc>
       </w:tr>
+      <w:tr>
+        <w:tc>
+          <w:tcPr>
+            <w:tcW w:type="dxa" w:w="1152"/>
+            <w:shd w:val="clear" w:color="auto" w:fill="F2F4F6"/>
+            <w:tcMar>
+              <w:top w:w="60" w:type="dxa"/>
+              <w:bottom w:w="60" w:type="dxa"/>
+              <w:left w:w="100" w:type="dxa"/>
+              <w:right w:w="100" w:type="dxa"/>
+            </w:tcMar>
+          </w:tcPr>
+          <w:p>
+            <w:pPr>
+              <w:spacing w:before="0" w:after="0"/>
+            </w:pPr>
+            <w:r/>
+            <w:r>
+              <w:rPr>
+                <w:color w:val="3C4752"/>
+                <w:sz w:val="19"/>
+              </w:rPr>
+              <w:t xml:space="preserve">1.17</w:t>
+            </w:r>
+          </w:p>
+        </w:tc>
+        <w:tc>
+          <w:tcPr>
+            <w:tcW w:type="dxa" w:w="1296"/>
+            <w:shd w:val="clear" w:color="auto" w:fill="F2F4F6"/>
+            <w:tcMar>
+              <w:top w:w="60" w:type="dxa"/>
+              <w:bottom w:w="60" w:type="dxa"/>
+              <w:left w:w="100" w:type="dxa"/>
+              <w:right w:w="100" w:type="dxa"/>
+            </w:tcMar>
+          </w:tcPr>
+          <w:p>
+            <w:pPr>
+              <w:spacing w:before="0" w:after="0"/>
+            </w:pPr>
+            <w:r/>
+            <w:r>
+              <w:rPr>
+                <w:color w:val="3C4752"/>
+                <w:sz w:val="19"/>
+              </w:rPr>
+              <w:t xml:space="preserve">2026-10-13</w:t>
+            </w:r>
+          </w:p>
+        </w:tc>
+        <w:tc>
+          <w:tcPr>
+            <w:tcW w:type="dxa" w:w="2592"/>
+            <w:shd w:val="clear" w:color="auto" w:fill="F2F4F6"/>
+            <w:tcMar>
+              <w:top w:w="60" w:type="dxa"/>
+              <w:bottom w:w="60" w:type="dxa"/>
+              <w:left w:w="100" w:type="dxa"/>
+              <w:right w:w="100" w:type="dxa"/>
+            </w:tcMar>
+          </w:tcPr>
+          <w:p>
+            <w:pPr>
+              <w:spacing w:before="0" w:after="0"/>
+            </w:pPr>
+            <w:r/>
+            <w:r>
+              <w:rPr>
+                <w:color w:val="3C4752"/>
+                <w:sz w:val="19"/>
+              </w:rPr>
+              <w:t xml:space="preserve">Product &amp; Engineering</w:t>
+            </w:r>
+          </w:p>
+        </w:tc>
+        <w:tc>
+          <w:tcPr>
+            <w:tcW w:type="dxa" w:w="3600"/>
+            <w:shd w:val="clear" w:color="auto" w:fill="F2F4F6"/>
+            <w:tcMar>
+              <w:top w:w="60" w:type="dxa"/>
+              <w:bottom w:w="60" w:type="dxa"/>
+              <w:left w:w="100" w:type="dxa"/>
+              <w:right w:w="100" w:type="dxa"/>
+            </w:tcMar>
+          </w:tcPr>
+          <w:p>
+            <w:pPr>
+              <w:spacing w:before="0" w:after="0"/>
+            </w:pPr>
+            <w:r/>
+            <w:r>
+              <w:rPr>
+                <w:color w:val="3C4752"/>
+                <w:sz w:val="19"/>
+              </w:rPr>
+              <w:t xml:space="preserve">Brought up to date through Sprint 57: Epic 13 gains seven stories (a working contact and grievance route with a queue, a deadline the queue measures, no relay to an address a stranger typed, limits on a public form, retention, export and erasure, and a browser journey); BL-14.3 done; section 4.4 records Sprint 57 and the next-sprint proposal now starts at Sprint 58.</w:t>
+            </w:r>
+          </w:p>
+        </w:tc>
+      </w:tr>
     </w:tbl>
     <w:p>
       <w:pPr>
@@ -3144,7 +3246,7 @@
           <w:b w:val="0"/>
           <w:i w:val="0"/>
         </w:rPr>
-        <w:t>Thirteen epics and one hundred and thirty-two stories, delivered from the walking skeleton through every-page browser checks, bulk update, layout stability, an enforced content-security policy and sign-in that cannot lock a person out (Sprint 56). Epics 1 to 12 are grouped by theme, with the sprint each story shipped in named alongside it. Epic 13 collects everything delivered since version 1.1, in sprint order, because the later work cuts across the themes above.</w:t>
+        <w:t>Thirteen epics and one hundred and thirty-nine stories, delivered from the walking skeleton through every-page browser checks, bulk update, layout stability, an enforced content-security policy and sign-in that cannot lock a person out (Sprint 56) and a grievance route with a deadline (Sprint 57). Epics 1 to 12 are grouped by theme, with the sprint each story shipped in named alongside it. Epic 13 collects everything delivered since version 1.1, in sprint order, because the later work cuts across the themes above.</w:t>
       </w:r>
     </w:p>
     <w:p>
@@ -14749,6 +14851,545 @@
           </w:p>
         </w:tc>
       </w:tr>
+      <w:tr>
+        <w:tc>
+          <w:tcPr>
+            <w:tcW w:type="dxa" w:w="720"/>
+            <w:shd w:val="clear" w:color="auto" w:fill="FFFFFF"/>
+            <w:tcMar>
+              <w:top w:w="60" w:type="dxa"/>
+              <w:bottom w:w="60" w:type="dxa"/>
+              <w:left w:w="100" w:type="dxa"/>
+              <w:right w:w="100" w:type="dxa"/>
+            </w:tcMar>
+          </w:tcPr>
+          <w:p>
+            <w:pPr>
+              <w:spacing w:before="0" w:after="0"/>
+            </w:pPr>
+            <w:r/>
+            <w:r>
+              <w:rPr>
+                <w:color w:val="3C4752"/>
+                <w:sz w:val="19"/>
+              </w:rPr>
+              <w:t xml:space="preserve">13.82</w:t>
+            </w:r>
+          </w:p>
+        </w:tc>
+        <w:tc>
+          <w:tcPr>
+            <w:tcW w:type="dxa" w:w="6912"/>
+            <w:shd w:val="clear" w:color="auto" w:fill="FFFFFF"/>
+            <w:tcMar>
+              <w:top w:w="60" w:type="dxa"/>
+              <w:bottom w:w="60" w:type="dxa"/>
+              <w:left w:w="100" w:type="dxa"/>
+              <w:right w:w="100" w:type="dxa"/>
+            </w:tcMar>
+          </w:tcPr>
+          <w:p>
+            <w:pPr>
+              <w:spacing w:before="0" w:after="0"/>
+            </w:pPr>
+            <w:r/>
+            <w:r>
+              <w:rPr>
+                <w:color w:val="3C4752"/>
+                <w:sz w:val="19"/>
+              </w:rPr>
+              <w:t xml:space="preserve">A message can be sent to us and kept: contact and grievance are real forms behind one table, a message gets a reference the sender keeps, and a signed-in sender sees their own messages and where each stands.</w:t>
+            </w:r>
+          </w:p>
+        </w:tc>
+        <w:tc>
+          <w:tcPr>
+            <w:tcW w:type="dxa" w:w="1296"/>
+            <w:shd w:val="clear" w:color="auto" w:fill="FFFFFF"/>
+            <w:tcMar>
+              <w:top w:w="60" w:type="dxa"/>
+              <w:bottom w:w="60" w:type="dxa"/>
+              <w:left w:w="100" w:type="dxa"/>
+              <w:right w:w="100" w:type="dxa"/>
+            </w:tcMar>
+          </w:tcPr>
+          <w:p>
+            <w:pPr>
+              <w:spacing w:before="0" w:after="0"/>
+            </w:pPr>
+            <w:r/>
+            <w:r>
+              <w:rPr>
+                <w:color w:val="3C4752"/>
+                <w:sz w:val="19"/>
+              </w:rPr>
+              <w:t xml:space="preserve">Sprint 57</w:t>
+            </w:r>
+          </w:p>
+        </w:tc>
+      </w:tr>
+      <w:tr>
+        <w:tc>
+          <w:tcPr>
+            <w:tcW w:type="dxa" w:w="720"/>
+            <w:shd w:val="clear" w:color="auto" w:fill="F2F4F6"/>
+            <w:tcMar>
+              <w:top w:w="60" w:type="dxa"/>
+              <w:bottom w:w="60" w:type="dxa"/>
+              <w:left w:w="100" w:type="dxa"/>
+              <w:right w:w="100" w:type="dxa"/>
+            </w:tcMar>
+          </w:tcPr>
+          <w:p>
+            <w:pPr>
+              <w:spacing w:before="0" w:after="0"/>
+            </w:pPr>
+            <w:r/>
+            <w:r>
+              <w:rPr>
+                <w:color w:val="3C4752"/>
+                <w:sz w:val="19"/>
+              </w:rPr>
+              <w:t xml:space="preserve">13.83</w:t>
+            </w:r>
+          </w:p>
+        </w:tc>
+        <w:tc>
+          <w:tcPr>
+            <w:tcW w:type="dxa" w:w="6912"/>
+            <w:shd w:val="clear" w:color="auto" w:fill="F2F4F6"/>
+            <w:tcMar>
+              <w:top w:w="60" w:type="dxa"/>
+              <w:bottom w:w="60" w:type="dxa"/>
+              <w:left w:w="100" w:type="dxa"/>
+              <w:right w:w="100" w:type="dxa"/>
+            </w:tcMar>
+          </w:tcPr>
+          <w:p>
+            <w:pPr>
+              <w:spacing w:before="0" w:after="0"/>
+            </w:pPr>
+            <w:r/>
+            <w:r>
+              <w:rPr>
+                <w:color w:val="3C4752"/>
+                <w:sz w:val="19"/>
+              </w:rPr>
+              <w:t xml:space="preserve">Who may send what is one rule: anyone may send a message or a grievance and must leave somewhere to reply; a request about their own data needs an account, because the account is the proof of who is asking.</w:t>
+            </w:r>
+          </w:p>
+        </w:tc>
+        <w:tc>
+          <w:tcPr>
+            <w:tcW w:type="dxa" w:w="1296"/>
+            <w:shd w:val="clear" w:color="auto" w:fill="F2F4F6"/>
+            <w:tcMar>
+              <w:top w:w="60" w:type="dxa"/>
+              <w:bottom w:w="60" w:type="dxa"/>
+              <w:left w:w="100" w:type="dxa"/>
+              <w:right w:w="100" w:type="dxa"/>
+            </w:tcMar>
+          </w:tcPr>
+          <w:p>
+            <w:pPr>
+              <w:spacing w:before="0" w:after="0"/>
+            </w:pPr>
+            <w:r/>
+            <w:r>
+              <w:rPr>
+                <w:color w:val="3C4752"/>
+                <w:sz w:val="19"/>
+              </w:rPr>
+              <w:t xml:space="preserve">Sprint 57</w:t>
+            </w:r>
+          </w:p>
+        </w:tc>
+      </w:tr>
+      <w:tr>
+        <w:tc>
+          <w:tcPr>
+            <w:tcW w:type="dxa" w:w="720"/>
+            <w:shd w:val="clear" w:color="auto" w:fill="FFFFFF"/>
+            <w:tcMar>
+              <w:top w:w="60" w:type="dxa"/>
+              <w:bottom w:w="60" w:type="dxa"/>
+              <w:left w:w="100" w:type="dxa"/>
+              <w:right w:w="100" w:type="dxa"/>
+            </w:tcMar>
+          </w:tcPr>
+          <w:p>
+            <w:pPr>
+              <w:spacing w:before="0" w:after="0"/>
+            </w:pPr>
+            <w:r/>
+            <w:r>
+              <w:rPr>
+                <w:color w:val="3C4752"/>
+                <w:sz w:val="19"/>
+              </w:rPr>
+              <w:t xml:space="preserve">13.84</w:t>
+            </w:r>
+          </w:p>
+        </w:tc>
+        <w:tc>
+          <w:tcPr>
+            <w:tcW w:type="dxa" w:w="6912"/>
+            <w:shd w:val="clear" w:color="auto" w:fill="FFFFFF"/>
+            <w:tcMar>
+              <w:top w:w="60" w:type="dxa"/>
+              <w:bottom w:w="60" w:type="dxa"/>
+              <w:left w:w="100" w:type="dxa"/>
+              <w:right w:w="100" w:type="dxa"/>
+            </w:tcMar>
+          </w:tcPr>
+          <w:p>
+            <w:pPr>
+              <w:spacing w:before="0" w:after="0"/>
+            </w:pPr>
+            <w:r/>
+            <w:r>
+              <w:rPr>
+                <w:color w:val="3C4752"/>
+                <w:sz w:val="19"/>
+              </w:rPr>
+              <w:t xml:space="preserve">We never write to an address a stranger typed: the operator replies by hand, a signed-in sender is told by an in-app notice and an email to their verified address, and the notice never carries the operator's note.</w:t>
+            </w:r>
+          </w:p>
+        </w:tc>
+        <w:tc>
+          <w:tcPr>
+            <w:tcW w:type="dxa" w:w="1296"/>
+            <w:shd w:val="clear" w:color="auto" w:fill="FFFFFF"/>
+            <w:tcMar>
+              <w:top w:w="60" w:type="dxa"/>
+              <w:bottom w:w="60" w:type="dxa"/>
+              <w:left w:w="100" w:type="dxa"/>
+              <w:right w:w="100" w:type="dxa"/>
+            </w:tcMar>
+          </w:tcPr>
+          <w:p>
+            <w:pPr>
+              <w:spacing w:before="0" w:after="0"/>
+            </w:pPr>
+            <w:r/>
+            <w:r>
+              <w:rPr>
+                <w:color w:val="3C4752"/>
+                <w:sz w:val="19"/>
+              </w:rPr>
+              <w:t xml:space="preserve">Sprint 57</w:t>
+            </w:r>
+          </w:p>
+        </w:tc>
+      </w:tr>
+      <w:tr>
+        <w:tc>
+          <w:tcPr>
+            <w:tcW w:type="dxa" w:w="720"/>
+            <w:shd w:val="clear" w:color="auto" w:fill="F2F4F6"/>
+            <w:tcMar>
+              <w:top w:w="60" w:type="dxa"/>
+              <w:bottom w:w="60" w:type="dxa"/>
+              <w:left w:w="100" w:type="dxa"/>
+              <w:right w:w="100" w:type="dxa"/>
+            </w:tcMar>
+          </w:tcPr>
+          <w:p>
+            <w:pPr>
+              <w:spacing w:before="0" w:after="0"/>
+            </w:pPr>
+            <w:r/>
+            <w:r>
+              <w:rPr>
+                <w:color w:val="3C4752"/>
+                <w:sz w:val="19"/>
+              </w:rPr>
+              <w:t xml:space="preserve">13.85</w:t>
+            </w:r>
+          </w:p>
+        </w:tc>
+        <w:tc>
+          <w:tcPr>
+            <w:tcW w:type="dxa" w:w="6912"/>
+            <w:shd w:val="clear" w:color="auto" w:fill="F2F4F6"/>
+            <w:tcMar>
+              <w:top w:w="60" w:type="dxa"/>
+              <w:bottom w:w="60" w:type="dxa"/>
+              <w:left w:w="100" w:type="dxa"/>
+              <w:right w:w="100" w:type="dxa"/>
+            </w:tcMar>
+          </w:tcPr>
+          <w:p>
+            <w:pPr>
+              <w:spacing w:before="0" w:after="0"/>
+            </w:pPr>
+            <w:r/>
+            <w:r>
+              <w:rPr>
+                <w:color w:val="3C4752"/>
+                <w:sz w:val="19"/>
+              </w:rPr>
+              <w:t xml:space="preserve">A public form carries its own limits: a budget per address and per sender (each proved alone), a hidden field that answers a bot with a fake success and keeps nothing, and a length cap.</w:t>
+            </w:r>
+          </w:p>
+        </w:tc>
+        <w:tc>
+          <w:tcPr>
+            <w:tcW w:type="dxa" w:w="1296"/>
+            <w:shd w:val="clear" w:color="auto" w:fill="F2F4F6"/>
+            <w:tcMar>
+              <w:top w:w="60" w:type="dxa"/>
+              <w:bottom w:w="60" w:type="dxa"/>
+              <w:left w:w="100" w:type="dxa"/>
+              <w:right w:w="100" w:type="dxa"/>
+            </w:tcMar>
+          </w:tcPr>
+          <w:p>
+            <w:pPr>
+              <w:spacing w:before="0" w:after="0"/>
+            </w:pPr>
+            <w:r/>
+            <w:r>
+              <w:rPr>
+                <w:color w:val="3C4752"/>
+                <w:sz w:val="19"/>
+              </w:rPr>
+              <w:t xml:space="preserve">Sprint 57</w:t>
+            </w:r>
+          </w:p>
+        </w:tc>
+      </w:tr>
+      <w:tr>
+        <w:tc>
+          <w:tcPr>
+            <w:tcW w:type="dxa" w:w="720"/>
+            <w:shd w:val="clear" w:color="auto" w:fill="FFFFFF"/>
+            <w:tcMar>
+              <w:top w:w="60" w:type="dxa"/>
+              <w:bottom w:w="60" w:type="dxa"/>
+              <w:left w:w="100" w:type="dxa"/>
+              <w:right w:w="100" w:type="dxa"/>
+            </w:tcMar>
+          </w:tcPr>
+          <w:p>
+            <w:pPr>
+              <w:spacing w:before="0" w:after="0"/>
+            </w:pPr>
+            <w:r/>
+            <w:r>
+              <w:rPr>
+                <w:color w:val="3C4752"/>
+                <w:sz w:val="19"/>
+              </w:rPr>
+              <w:t xml:space="preserve">13.86</w:t>
+            </w:r>
+          </w:p>
+        </w:tc>
+        <w:tc>
+          <w:tcPr>
+            <w:tcW w:type="dxa" w:w="6912"/>
+            <w:shd w:val="clear" w:color="auto" w:fill="FFFFFF"/>
+            <w:tcMar>
+              <w:top w:w="60" w:type="dxa"/>
+              <w:bottom w:w="60" w:type="dxa"/>
+              <w:left w:w="100" w:type="dxa"/>
+              <w:right w:w="100" w:type="dxa"/>
+            </w:tcMar>
+          </w:tcPr>
+          <w:p>
+            <w:pPr>
+              <w:spacing w:before="0" w:after="0"/>
+            </w:pPr>
+            <w:r/>
+            <w:r>
+              <w:rPr>
+                <w:color w:val="3C4752"/>
+                <w:sz w:val="19"/>
+              </w:rPr>
+              <w:t xml:space="preserve">The grievance page's promise is measured: the operator queue marks a message overdue against the page's own 24 hours and 15 days, read from settings; the account is shown masked; every decision takes a lock, is final, and needs a note to close.</w:t>
+            </w:r>
+          </w:p>
+        </w:tc>
+        <w:tc>
+          <w:tcPr>
+            <w:tcW w:type="dxa" w:w="1296"/>
+            <w:shd w:val="clear" w:color="auto" w:fill="FFFFFF"/>
+            <w:tcMar>
+              <w:top w:w="60" w:type="dxa"/>
+              <w:bottom w:w="60" w:type="dxa"/>
+              <w:left w:w="100" w:type="dxa"/>
+              <w:right w:w="100" w:type="dxa"/>
+            </w:tcMar>
+          </w:tcPr>
+          <w:p>
+            <w:pPr>
+              <w:spacing w:before="0" w:after="0"/>
+            </w:pPr>
+            <w:r/>
+            <w:r>
+              <w:rPr>
+                <w:color w:val="3C4752"/>
+                <w:sz w:val="19"/>
+              </w:rPr>
+              <w:t xml:space="preserve">Sprint 57</w:t>
+            </w:r>
+          </w:p>
+        </w:tc>
+      </w:tr>
+      <w:tr>
+        <w:tc>
+          <w:tcPr>
+            <w:tcW w:type="dxa" w:w="720"/>
+            <w:shd w:val="clear" w:color="auto" w:fill="F2F4F6"/>
+            <w:tcMar>
+              <w:top w:w="60" w:type="dxa"/>
+              <w:bottom w:w="60" w:type="dxa"/>
+              <w:left w:w="100" w:type="dxa"/>
+              <w:right w:w="100" w:type="dxa"/>
+            </w:tcMar>
+          </w:tcPr>
+          <w:p>
+            <w:pPr>
+              <w:spacing w:before="0" w:after="0"/>
+            </w:pPr>
+            <w:r/>
+            <w:r>
+              <w:rPr>
+                <w:color w:val="3C4752"/>
+                <w:sz w:val="19"/>
+              </w:rPr>
+              <w:t xml:space="preserve">13.87</w:t>
+            </w:r>
+          </w:p>
+        </w:tc>
+        <w:tc>
+          <w:tcPr>
+            <w:tcW w:type="dxa" w:w="6912"/>
+            <w:shd w:val="clear" w:color="auto" w:fill="F2F4F6"/>
+            <w:tcMar>
+              <w:top w:w="60" w:type="dxa"/>
+              <w:bottom w:w="60" w:type="dxa"/>
+              <w:left w:w="100" w:type="dxa"/>
+              <w:right w:w="100" w:type="dxa"/>
+            </w:tcMar>
+          </w:tcPr>
+          <w:p>
+            <w:pPr>
+              <w:spacing w:before="0" w:after="0"/>
+            </w:pPr>
+            <w:r/>
+            <w:r>
+              <w:rPr>
+                <w:color w:val="3C4752"/>
+                <w:sz w:val="19"/>
+              </w:rPr>
+              <w:t xml:space="preserve">A closed message is deleted a year after it was closed and an open one never; the personal-data export lists a person's messages (without the operator's note) and erasure removes them.</w:t>
+            </w:r>
+          </w:p>
+        </w:tc>
+        <w:tc>
+          <w:tcPr>
+            <w:tcW w:type="dxa" w:w="1296"/>
+            <w:shd w:val="clear" w:color="auto" w:fill="F2F4F6"/>
+            <w:tcMar>
+              <w:top w:w="60" w:type="dxa"/>
+              <w:bottom w:w="60" w:type="dxa"/>
+              <w:left w:w="100" w:type="dxa"/>
+              <w:right w:w="100" w:type="dxa"/>
+            </w:tcMar>
+          </w:tcPr>
+          <w:p>
+            <w:pPr>
+              <w:spacing w:before="0" w:after="0"/>
+            </w:pPr>
+            <w:r/>
+            <w:r>
+              <w:rPr>
+                <w:color w:val="3C4752"/>
+                <w:sz w:val="19"/>
+              </w:rPr>
+              <w:t xml:space="preserve">Sprint 57</w:t>
+            </w:r>
+          </w:p>
+        </w:tc>
+      </w:tr>
+      <w:tr>
+        <w:tc>
+          <w:tcPr>
+            <w:tcW w:type="dxa" w:w="720"/>
+            <w:shd w:val="clear" w:color="auto" w:fill="FFFFFF"/>
+            <w:tcMar>
+              <w:top w:w="60" w:type="dxa"/>
+              <w:bottom w:w="60" w:type="dxa"/>
+              <w:left w:w="100" w:type="dxa"/>
+              <w:right w:w="100" w:type="dxa"/>
+            </w:tcMar>
+          </w:tcPr>
+          <w:p>
+            <w:pPr>
+              <w:spacing w:before="0" w:after="0"/>
+            </w:pPr>
+            <w:r/>
+            <w:r>
+              <w:rPr>
+                <w:color w:val="3C4752"/>
+                <w:sz w:val="19"/>
+              </w:rPr>
+              <w:t xml:space="preserve">13.88</w:t>
+            </w:r>
+          </w:p>
+        </w:tc>
+        <w:tc>
+          <w:tcPr>
+            <w:tcW w:type="dxa" w:w="6912"/>
+            <w:shd w:val="clear" w:color="auto" w:fill="FFFFFF"/>
+            <w:tcMar>
+              <w:top w:w="60" w:type="dxa"/>
+              <w:bottom w:w="60" w:type="dxa"/>
+              <w:left w:w="100" w:type="dxa"/>
+              <w:right w:w="100" w:type="dxa"/>
+            </w:tcMar>
+          </w:tcPr>
+          <w:p>
+            <w:pPr>
+              <w:spacing w:before="0" w:after="0"/>
+            </w:pPr>
+            <w:r/>
+            <w:r>
+              <w:rPr>
+                <w:color w:val="3C4752"/>
+                <w:sz w:val="19"/>
+              </w:rPr>
+              <w:t xml:space="preserve">A browser journey sends a complaint as a stranger and as a signed-in person, answers it as an operator and checks the sender sees it resolved; it found that the queue's default view hid an acknowledged message, now fixed.</w:t>
+            </w:r>
+          </w:p>
+        </w:tc>
+        <w:tc>
+          <w:tcPr>
+            <w:tcW w:type="dxa" w:w="1296"/>
+            <w:shd w:val="clear" w:color="auto" w:fill="FFFFFF"/>
+            <w:tcMar>
+              <w:top w:w="60" w:type="dxa"/>
+              <w:bottom w:w="60" w:type="dxa"/>
+              <w:left w:w="100" w:type="dxa"/>
+              <w:right w:w="100" w:type="dxa"/>
+            </w:tcMar>
+          </w:tcPr>
+          <w:p>
+            <w:pPr>
+              <w:spacing w:before="0" w:after="0"/>
+            </w:pPr>
+            <w:r/>
+            <w:r>
+              <w:rPr>
+                <w:color w:val="3C4752"/>
+                <w:sz w:val="19"/>
+              </w:rPr>
+              <w:t xml:space="preserve">Sprint 57</w:t>
+            </w:r>
+          </w:p>
+        </w:tc>
+      </w:tr>
     </w:tbl>
     <w:p>
       <w:pPr>
@@ -14788,7 +15429,7 @@
         <w:pStyle w:val="Heading2"/>
       </w:pPr>
       <w:r>
-        <w:t>Status at a Glance — Version 1.16 (2026-10-13)</w:t>
+        <w:t>Status at a Glance — Version 1.17 (2026-10-13)</w:t>
       </w:r>
     </w:p>
     <w:p>
@@ -19859,25 +20500,25 @@
         <w:tc>
           <w:tcPr>
             <w:tcW w:type="dxa" w:w="1250"/>
-            <w:shd w:val="clear" w:color="auto" w:fill="FFFFFF"/>
-            <w:tcMar>
-              <w:top w:w="60" w:type="dxa"/>
-              <w:bottom w:w="60" w:type="dxa"/>
-              <w:left w:w="100" w:type="dxa"/>
-              <w:right w:w="100" w:type="dxa"/>
-            </w:tcMar>
-          </w:tcPr>
-          <w:p>
-            <w:pPr>
-              <w:spacing w:before="0" w:after="0"/>
-            </w:pPr>
-            <w:r/>
-            <w:r>
-              <w:rPr>
-                <w:color w:val="3C4752"/>
-                <w:sz w:val="19"/>
-              </w:rPr>
-              <w:t xml:space="preserve">To do — Now</w:t>
+            <w:shd w:val="clear" w:color="auto" w:fill="E3F2E6"/>
+            <w:tcMar>
+              <w:top w:w="60" w:type="dxa"/>
+              <w:bottom w:w="60" w:type="dxa"/>
+              <w:left w:w="100" w:type="dxa"/>
+              <w:right w:w="100" w:type="dxa"/>
+            </w:tcMar>
+          </w:tcPr>
+          <w:p>
+            <w:pPr>
+              <w:spacing w:before="0" w:after="0"/>
+            </w:pPr>
+            <w:r/>
+            <w:r>
+              <w:rPr>
+                <w:color w:val="3C4752"/>
+                <w:sz w:val="19"/>
+              </w:rPr>
+              <w:t xml:space="preserve">Done</w:t>
             </w:r>
           </w:p>
         </w:tc>
@@ -19902,7 +20543,7 @@
                 <w:color w:val="3C4752"/>
                 <w:sz w:val="19"/>
               </w:rPr>
-              <w:t xml:space="preserve">New in v1.15. Sprint 57.</w:t>
+              <w:t xml:space="preserve">Sprint 57 (ADR-067). A grievance is a row with a deadline, and nothing is written to an address a stranger typed.</w:t>
             </w:r>
           </w:p>
         </w:tc>
@@ -25518,7 +26159,7 @@
           <w:color w:val="3C4752"/>
           <w:sz w:val="18"/>
         </w:rPr>
-        <w:t>Not started. The contact page is a placeholder and the grievance page is static text; the Digital Personal Data Protection Act expects a working grievance route before real users.</w:t>
+        <w:t>Done in Sprint 57 (ADR-067). The contact and grievance pages are forms behind one table; the operator queue measures the page's own promise (acknowledged within 24 hours, resolved within 15 days); a stranger must leave somewhere to reply and is never written to; a request about one's own data needs an account; closed messages are deleted after a year. The grievance officer is still to be appointed, and a mailbox for the operator to reply from is the owner's to provide.</w:t>
       </w:r>
     </w:p>
     <w:p>
@@ -27184,7 +27825,7 @@
     <w:p>
       <w:pPr/>
       <w:r>
-        <w:t xml:space="preserve">A record of what the sprints since version 1.1 delivered, followed by a proposal for the next one. Sprints 41 to 55 are merged into main (pull requests #17 to #41). Sprint 56 is on its own branch and not yet merged.</w:t>
+        <w:t xml:space="preserve">A record of what the sprints since version 1.1 delivered, followed by a proposal for the next one. Sprints 41 to 56 are merged into main (pull requests #17 to #42). Sprint 57 is on its own branch and not yet merged.</w:t>
       </w:r>
     </w:p>
     <w:tbl>
@@ -28601,11 +29242,63 @@
           </w:p>
         </w:tc>
       </w:tr>
+      <w:tr>
+        <w:tc>
+          <w:tcPr>
+            <w:tcW w:type="dxa" w:w="1200"/>
+            <w:shd w:val="clear" w:color="auto" w:fill="F2F4F6"/>
+            <w:tcMar>
+              <w:top w:w="60" w:type="dxa"/>
+              <w:bottom w:w="60" w:type="dxa"/>
+              <w:left w:w="100" w:type="dxa"/>
+              <w:right w:w="100" w:type="dxa"/>
+            </w:tcMar>
+          </w:tcPr>
+          <w:p>
+            <w:pPr>
+              <w:spacing w:before="0" w:after="0"/>
+            </w:pPr>
+            <w:r/>
+            <w:r>
+              <w:rPr>
+                <w:color w:val="3C4752"/>
+                <w:sz w:val="19"/>
+              </w:rPr>
+              <w:t xml:space="preserve">57</w:t>
+            </w:r>
+          </w:p>
+        </w:tc>
+        <w:tc>
+          <w:tcPr>
+            <w:tcW w:type="dxa" w:w="7728"/>
+            <w:shd w:val="clear" w:color="auto" w:fill="F2F4F6"/>
+            <w:tcMar>
+              <w:top w:w="60" w:type="dxa"/>
+              <w:bottom w:w="60" w:type="dxa"/>
+              <w:left w:w="100" w:type="dxa"/>
+              <w:right w:w="100" w:type="dxa"/>
+            </w:tcMar>
+          </w:tcPr>
+          <w:p>
+            <w:pPr>
+              <w:spacing w:before="0" w:after="0"/>
+            </w:pPr>
+            <w:r/>
+            <w:r>
+              <w:rPr>
+                <w:color w:val="3C4752"/>
+                <w:sz w:val="19"/>
+              </w:rPr>
+              <w:t xml:space="preserve">A way to complain: contact and grievance are forms behind one table, with an operator queue that marks what is overdue against the page's own 24 hours and 15 days; no relay to an address a stranger typed, a budget and a honeypot on the public endpoint, retention, export and erasure; the journey found that the queue's default hid an acknowledged message (ADR-067, migration 0050).</w:t>
+            </w:r>
+          </w:p>
+        </w:tc>
+      </w:tr>
     </w:tbl>
     <w:p>
       <w:pPr/>
       <w:r>
-        <w:t xml:space="preserve">Proposal for Sprints 57 to 61, for discussion (version 1.16). SEO, deployment, monetisation and real external integrations stay deferred by the Product Owner; every sprint below is code-only. If one runs long, its cut line is: Sprint 59 ships report and takedown and defers the removal notice; Sprint 60 ships the message and defers the export; Sprint 61 can wait for a real agency.</w:t>
+        <w:t xml:space="preserve">Proposal for Sprints 58 to 61, for discussion (version 1.17). SEO, deployment, monetisation and real external integrations stay deferred by the Product Owner; every sprint below is code-only. If one runs long, its cut line is: Sprint 59 ships report and takedown and defers the removal notice; Sprint 60 ships the message and defers the export; Sprint 61 can wait for a real agency.</w:t>
       </w:r>
     </w:p>
     <w:tbl>
@@ -28742,7 +29435,7 @@
                 <w:color w:val="3C4752"/>
                 <w:sz w:val="19"/>
               </w:rPr>
-              <w:t xml:space="preserve">BL-14.3: A way to complain (Sprint 57)</w:t>
+              <w:t xml:space="preserve">BL-14.5, BL-14.6: Courses you can attend (Sprint 58)</w:t>
             </w:r>
           </w:p>
         </w:tc>
@@ -28767,7 +29460,7 @@
                 <w:color w:val="3C4752"/>
                 <w:sz w:val="19"/>
               </w:rPr>
-              <w:t xml:space="preserve">The Digital Personal Data Protection Act expects a working grievance route before real users. Small, and the contact and grievance pages are placeholders today.</w:t>
+              <w:t xml:space="preserve">The core promise is the course that closes the gap, and a course with no place or intake date cannot be attended. The scorer does not change.</w:t>
             </w:r>
           </w:p>
         </w:tc>
@@ -28819,7 +29512,7 @@
                 <w:color w:val="3C4752"/>
                 <w:sz w:val="19"/>
               </w:rPr>
-              <w:t xml:space="preserve">BL-14.5, BL-14.6: Courses you can attend (Sprint 58)</w:t>
+              <w:t xml:space="preserve">BL-14.4: A marketplace you can trust (Sprint 59)</w:t>
             </w:r>
           </w:p>
         </w:tc>
@@ -28844,7 +29537,7 @@
                 <w:color w:val="3C4752"/>
                 <w:sz w:val="19"/>
               </w:rPr>
-              <w:t xml:space="preserve">The core promise is the course that closes the gap, and a course with no place or intake date cannot be attended. The scorer does not change.</w:t>
+              <w:t xml:space="preserve">Fake vacancies are the main trust risk of a jobs marketplace and the only lever today is the owner unpublishing. Large; reuses the operator queue built in Sprint 57.</w:t>
             </w:r>
           </w:p>
         </w:tc>
@@ -28896,7 +29589,7 @@
                 <w:color w:val="3C4752"/>
                 <w:sz w:val="19"/>
               </w:rPr>
-              <w:t xml:space="preserve">BL-14.4: A marketplace you can trust (Sprint 59)</w:t>
+              <w:t xml:space="preserve">BL-14.7 to BL-14.9: Hiring that finishes (Sprint 60)</w:t>
             </w:r>
           </w:p>
         </w:tc>
@@ -28921,7 +29614,7 @@
                 <w:color w:val="3C4752"/>
                 <w:sz w:val="19"/>
               </w:rPr>
-              <w:t xml:space="preserve">Fake vacancies are the main trust risk of a jobs marketplace and the only lever today is the owner unpublishing. Large; reuses the operator queue from Sprint 57.</w:t>
+              <w:t xml:space="preserve">The employer can change a status but cannot say when or where, and the candidate has no notification page.</w:t>
             </w:r>
           </w:p>
         </w:tc>
@@ -28973,7 +29666,7 @@
                 <w:color w:val="3C4752"/>
                 <w:sz w:val="19"/>
               </w:rPr>
-              <w:t xml:space="preserve">BL-14.7 to BL-14.9: Hiring that finishes (Sprint 60)</w:t>
+              <w:t xml:space="preserve">BL-14.10: A pilot with an agency (Sprint 61)</w:t>
             </w:r>
           </w:p>
         </w:tc>
@@ -28981,83 +29674,6 @@
           <w:tcPr>
             <w:tcW w:type="dxa" w:w="4128"/>
             <w:shd w:val="clear" w:color="auto" w:fill="FFFFFF"/>
-            <w:tcMar>
-              <w:top w:w="60" w:type="dxa"/>
-              <w:bottom w:w="60" w:type="dxa"/>
-              <w:left w:w="100" w:type="dxa"/>
-              <w:right w:w="100" w:type="dxa"/>
-            </w:tcMar>
-          </w:tcPr>
-          <w:p>
-            <w:pPr>
-              <w:spacing w:before="0" w:after="0"/>
-            </w:pPr>
-            <w:r/>
-            <w:r>
-              <w:rPr>
-                <w:color w:val="3C4752"/>
-                <w:sz w:val="19"/>
-              </w:rPr>
-              <w:t xml:space="preserve">The employer can change a status but cannot say when or where, and the candidate has no notification page.</w:t>
-            </w:r>
-          </w:p>
-        </w:tc>
-      </w:tr>
-      <w:tr>
-        <w:tc>
-          <w:tcPr>
-            <w:tcW w:type="dxa" w:w="1200"/>
-            <w:shd w:val="clear" w:color="auto" w:fill="F2F4F6"/>
-            <w:tcMar>
-              <w:top w:w="60" w:type="dxa"/>
-              <w:bottom w:w="60" w:type="dxa"/>
-              <w:left w:w="100" w:type="dxa"/>
-              <w:right w:w="100" w:type="dxa"/>
-            </w:tcMar>
-          </w:tcPr>
-          <w:p>
-            <w:pPr>
-              <w:spacing w:before="0" w:after="0"/>
-            </w:pPr>
-            <w:r/>
-            <w:r>
-              <w:rPr>
-                <w:color w:val="3C4752"/>
-                <w:sz w:val="19"/>
-              </w:rPr>
-              <w:t xml:space="preserve">5</w:t>
-            </w:r>
-          </w:p>
-        </w:tc>
-        <w:tc>
-          <w:tcPr>
-            <w:tcW w:type="dxa" w:w="3600"/>
-            <w:shd w:val="clear" w:color="auto" w:fill="F2F4F6"/>
-            <w:tcMar>
-              <w:top w:w="60" w:type="dxa"/>
-              <w:bottom w:w="60" w:type="dxa"/>
-              <w:left w:w="100" w:type="dxa"/>
-              <w:right w:w="100" w:type="dxa"/>
-            </w:tcMar>
-          </w:tcPr>
-          <w:p>
-            <w:pPr>
-              <w:spacing w:before="0" w:after="0"/>
-            </w:pPr>
-            <w:r/>
-            <w:r>
-              <w:rPr>
-                <w:color w:val="3C4752"/>
-                <w:sz w:val="19"/>
-              </w:rPr>
-              <w:t xml:space="preserve">BL-14.10: A pilot with an agency (Sprint 61)</w:t>
-            </w:r>
-          </w:p>
-        </w:tc>
-        <w:tc>
-          <w:tcPr>
-            <w:tcW w:type="dxa" w:w="4128"/>
-            <w:shd w:val="clear" w:color="auto" w:fill="F2F4F6"/>
             <w:tcMar>
               <w:top w:w="60" w:type="dxa"/>
               <w:bottom w:w="60" w:type="dxa"/>

</xml_diff>